<commit_message>
slide 2 and footnote
</commit_message>
<xml_diff>
--- a/MaghaleNegar/Templates/MainTemplate.docx
+++ b/MaghaleNegar/Templates/MainTemplate.docx
@@ -242,58 +242,25 @@
         </w:p>
       </w:sdtContent>
     </w:sdt>
-    <w:sdt>
-      <w:sdtPr>
-        <w:rPr>
-          <w:rtl/>
-        </w:rPr>
-        <w:tag w:val="AuthorNamesFa"/>
-        <w:id w:val="-829748140"/>
-        <w:placeholder>
-          <w:docPart w:val="DefaultPlaceholder_-1854013440"/>
-        </w:placeholder>
-        <w:text/>
-      </w:sdtPr>
-      <w:sdtEndPr/>
-      <w:sdtContent>
-        <w:p>
-          <w:pPr>
-            <w:pStyle w:val="AuthorNegar"/>
-            <w:rPr>
-              <w:rFonts w:eastAsia="Calibri"/>
-            </w:rPr>
-          </w:pPr>
-          <w:r>
-            <w:rPr>
-              <w:rtl/>
-            </w:rPr>
-            <w:t>صارم</w:t>
-          </w:r>
-          <w:r>
-            <w:rPr>
-              <w:rFonts w:hint="cs"/>
-              <w:rtl/>
-            </w:rPr>
-            <w:t>ی</w:t>
-          </w:r>
-          <w:r>
-            <w:rPr>
-              <w:rtl/>
-            </w:rPr>
-            <w:t xml:space="preserve"> (</w:t>
-          </w:r>
-          <w:r>
-            <w:t>snm@yahoo.com</w:t>
-          </w:r>
-          <w:r>
-            <w:rPr>
-              <w:rtl/>
-            </w:rPr>
-            <w:t>)</w:t>
-          </w:r>
-        </w:p>
-      </w:sdtContent>
-    </w:sdt>
+    <w:p>
+      <w:pPr>
+        <w:pStyle w:val="AuthorNegar"/>
+        <w:rPr>
+          <w:rFonts w:eastAsia="Calibri"/>
+        </w:rPr>
+      </w:pPr>
+      <w:bookmarkStart w:id="0" w:name="AuthorNamesFa"/>
+      <w:bookmarkEnd w:id="0"/>
+    </w:p>
+    <w:p>
+      <w:pPr>
+        <w:pStyle w:val="AuthorNegar"/>
+        <w:jc w:val="left"/>
+        <w:rPr>
+          <w:rFonts w:eastAsia="Calibri"/>
+        </w:rPr>
+      </w:pPr>
+    </w:p>
     <w:p>
       <w:pPr>
         <w:rPr>
@@ -956,35 +923,16 @@
         </w:p>
       </w:sdtContent>
     </w:sdt>
-    <w:sdt>
-      <w:sdtPr>
-        <w:rPr>
-          <w:rFonts w:hint="cs"/>
-        </w:rPr>
-        <w:tag w:val="AuthorNamesEn"/>
-        <w:id w:val="-258833405"/>
-        <w:placeholder>
-          <w:docPart w:val="9BF0DB3FFB334FB9BB848DE63B909EB3"/>
-        </w:placeholder>
-        <w:text/>
-      </w:sdtPr>
-      <w:sdtEndPr/>
-      <w:sdtContent>
-        <w:p>
-          <w:pPr>
-            <w:pStyle w:val="AuthorNegar"/>
-            <w:bidi w:val="0"/>
-            <w:rPr>
-              <w:rFonts w:eastAsia="Calibri"/>
-              <w:rtl/>
-            </w:rPr>
-          </w:pPr>
-          <w:r>
-            <w:t>Author Name</w:t>
-          </w:r>
-        </w:p>
-      </w:sdtContent>
-    </w:sdt>
+    <w:p>
+      <w:pPr>
+        <w:jc w:val="center"/>
+        <w:rPr>
+          <w:lang w:eastAsia="en-US" w:bidi="fa-IR"/>
+        </w:rPr>
+      </w:pPr>
+      <w:bookmarkStart w:id="1" w:name="AuthorNamesEn"/>
+      <w:bookmarkEnd w:id="1"/>
+    </w:p>
     <w:p>
       <w:pPr>
         <w:rPr>
@@ -1085,9 +1033,16 @@
       </w:r>
     </w:p>
     <w:sectPr>
-      <w:pgSz w:w="11906" w:h="16838"/>
+      <w:headerReference w:type="even" r:id="rId7"/>
+      <w:headerReference w:type="default" r:id="rId8"/>
+      <w:footerReference w:type="even" r:id="rId9"/>
+      <w:footerReference w:type="default" r:id="rId10"/>
+      <w:headerReference w:type="first" r:id="rId11"/>
+      <w:footerReference w:type="first" r:id="rId12"/>
+      <w:pgSz w:w="11906" w:h="16838" w:code="9"/>
       <w:pgMar w:top="2268" w:right="2835" w:bottom="1701" w:left="1701" w:header="709" w:footer="709" w:gutter="0"/>
       <w:cols w:space="708"/>
+      <w:titlePg/>
       <w:bidi/>
       <w:docGrid w:linePitch="360"/>
     </w:sectPr>
@@ -1114,6 +1069,36 @@
 </w:endnotes>
 </file>
 
+<file path=word/footer1.xml><?xml version="1.0" encoding="utf-8"?>
+<w:ftr xmlns:wpc="http://schemas.microsoft.com/office/word/2010/wordprocessingCanvas" xmlns:cx="http://schemas.microsoft.com/office/drawing/2014/chartex" xmlns:cx1="http://schemas.microsoft.com/office/drawing/2015/9/8/chartex" xmlns:cx2="http://schemas.microsoft.com/office/drawing/2015/10/21/chartex" xmlns:cx3="http://schemas.microsoft.com/office/drawing/2016/5/9/chartex" xmlns:cx4="http://schemas.microsoft.com/office/drawing/2016/5/10/chartex" xmlns:cx5="http://schemas.microsoft.com/office/drawing/2016/5/11/chartex" xmlns:cx6="http://schemas.microsoft.com/office/drawing/2016/5/12/chartex" xmlns:cx7="http://schemas.microsoft.com/office/drawing/2016/5/13/chartex" xmlns:cx8="http://schemas.microsoft.com/office/drawing/2016/5/14/chartex" xmlns:mc="http://schemas.openxmlformats.org/markup-compatibility/2006" xmlns:aink="http://schemas.microsoft.com/office/drawing/2016/ink" xmlns:am3d="http://schemas.microsoft.com/office/drawing/2017/model3d" xmlns:o="urn:schemas-microsoft-com:office:office" xmlns:r="http://schemas.openxmlformats.org/officeDocument/2006/relationships" xmlns:m="http://schemas.openxmlformats.org/officeDocument/2006/math" xmlns:v="urn:schemas-microsoft-com:vml" xmlns:wp14="http://schemas.microsoft.com/office/word/2010/wordprocessingDrawing" xmlns:wp="http://schemas.openxmlformats.org/drawingml/2006/wordprocessingDrawing" xmlns:w10="urn:schemas-microsoft-com:office:word" xmlns:w="http://schemas.openxmlformats.org/wordprocessingml/2006/main" xmlns:w14="http://schemas.microsoft.com/office/word/2010/wordml" xmlns:w15="http://schemas.microsoft.com/office/word/2012/wordml" xmlns:w16cex="http://schemas.microsoft.com/office/word/2018/wordml/cex" xmlns:w16cid="http://schemas.microsoft.com/office/word/2016/wordml/cid" xmlns:w16="http://schemas.microsoft.com/office/word/2018/wordml" xmlns:w16sdtdh="http://schemas.microsoft.com/office/word/2020/wordml/sdtdatahash" xmlns:w16se="http://schemas.microsoft.com/office/word/2015/wordml/symex" xmlns:wpg="http://schemas.microsoft.com/office/word/2010/wordprocessingGroup" xmlns:wpi="http://schemas.microsoft.com/office/word/2010/wordprocessingInk" xmlns:wne="http://schemas.microsoft.com/office/word/2006/wordml" xmlns:wps="http://schemas.microsoft.com/office/word/2010/wordprocessingShape" mc:Ignorable="w14 w15 w16se w16cid w16 w16cex w16sdtdh wp14">
+  <w:p>
+    <w:pPr>
+      <w:pStyle w:val="Footer"/>
+    </w:pPr>
+  </w:p>
+</w:ftr>
+</file>
+
+<file path=word/footer2.xml><?xml version="1.0" encoding="utf-8"?>
+<w:ftr xmlns:wpc="http://schemas.microsoft.com/office/word/2010/wordprocessingCanvas" xmlns:cx="http://schemas.microsoft.com/office/drawing/2014/chartex" xmlns:cx1="http://schemas.microsoft.com/office/drawing/2015/9/8/chartex" xmlns:cx2="http://schemas.microsoft.com/office/drawing/2015/10/21/chartex" xmlns:cx3="http://schemas.microsoft.com/office/drawing/2016/5/9/chartex" xmlns:cx4="http://schemas.microsoft.com/office/drawing/2016/5/10/chartex" xmlns:cx5="http://schemas.microsoft.com/office/drawing/2016/5/11/chartex" xmlns:cx6="http://schemas.microsoft.com/office/drawing/2016/5/12/chartex" xmlns:cx7="http://schemas.microsoft.com/office/drawing/2016/5/13/chartex" xmlns:cx8="http://schemas.microsoft.com/office/drawing/2016/5/14/chartex" xmlns:mc="http://schemas.openxmlformats.org/markup-compatibility/2006" xmlns:aink="http://schemas.microsoft.com/office/drawing/2016/ink" xmlns:am3d="http://schemas.microsoft.com/office/drawing/2017/model3d" xmlns:o="urn:schemas-microsoft-com:office:office" xmlns:r="http://schemas.openxmlformats.org/officeDocument/2006/relationships" xmlns:m="http://schemas.openxmlformats.org/officeDocument/2006/math" xmlns:v="urn:schemas-microsoft-com:vml" xmlns:wp14="http://schemas.microsoft.com/office/word/2010/wordprocessingDrawing" xmlns:wp="http://schemas.openxmlformats.org/drawingml/2006/wordprocessingDrawing" xmlns:w10="urn:schemas-microsoft-com:office:word" xmlns:w="http://schemas.openxmlformats.org/wordprocessingml/2006/main" xmlns:w14="http://schemas.microsoft.com/office/word/2010/wordml" xmlns:w15="http://schemas.microsoft.com/office/word/2012/wordml" xmlns:w16cex="http://schemas.microsoft.com/office/word/2018/wordml/cex" xmlns:w16cid="http://schemas.microsoft.com/office/word/2016/wordml/cid" xmlns:w16="http://schemas.microsoft.com/office/word/2018/wordml" xmlns:w16sdtdh="http://schemas.microsoft.com/office/word/2020/wordml/sdtdatahash" xmlns:w16se="http://schemas.microsoft.com/office/word/2015/wordml/symex" xmlns:wpg="http://schemas.microsoft.com/office/word/2010/wordprocessingGroup" xmlns:wpi="http://schemas.microsoft.com/office/word/2010/wordprocessingInk" xmlns:wne="http://schemas.microsoft.com/office/word/2006/wordml" xmlns:wps="http://schemas.microsoft.com/office/word/2010/wordprocessingShape" mc:Ignorable="w14 w15 w16se w16cid w16 w16cex w16sdtdh wp14">
+  <w:p>
+    <w:pPr>
+      <w:pStyle w:val="Footer"/>
+    </w:pPr>
+  </w:p>
+</w:ftr>
+</file>
+
+<file path=word/footer3.xml><?xml version="1.0" encoding="utf-8"?>
+<w:ftr xmlns:wpc="http://schemas.microsoft.com/office/word/2010/wordprocessingCanvas" xmlns:cx="http://schemas.microsoft.com/office/drawing/2014/chartex" xmlns:cx1="http://schemas.microsoft.com/office/drawing/2015/9/8/chartex" xmlns:cx2="http://schemas.microsoft.com/office/drawing/2015/10/21/chartex" xmlns:cx3="http://schemas.microsoft.com/office/drawing/2016/5/9/chartex" xmlns:cx4="http://schemas.microsoft.com/office/drawing/2016/5/10/chartex" xmlns:cx5="http://schemas.microsoft.com/office/drawing/2016/5/11/chartex" xmlns:cx6="http://schemas.microsoft.com/office/drawing/2016/5/12/chartex" xmlns:cx7="http://schemas.microsoft.com/office/drawing/2016/5/13/chartex" xmlns:cx8="http://schemas.microsoft.com/office/drawing/2016/5/14/chartex" xmlns:mc="http://schemas.openxmlformats.org/markup-compatibility/2006" xmlns:aink="http://schemas.microsoft.com/office/drawing/2016/ink" xmlns:am3d="http://schemas.microsoft.com/office/drawing/2017/model3d" xmlns:o="urn:schemas-microsoft-com:office:office" xmlns:r="http://schemas.openxmlformats.org/officeDocument/2006/relationships" xmlns:m="http://schemas.openxmlformats.org/officeDocument/2006/math" xmlns:v="urn:schemas-microsoft-com:vml" xmlns:wp14="http://schemas.microsoft.com/office/word/2010/wordprocessingDrawing" xmlns:wp="http://schemas.openxmlformats.org/drawingml/2006/wordprocessingDrawing" xmlns:w10="urn:schemas-microsoft-com:office:word" xmlns:w="http://schemas.openxmlformats.org/wordprocessingml/2006/main" xmlns:w14="http://schemas.microsoft.com/office/word/2010/wordml" xmlns:w15="http://schemas.microsoft.com/office/word/2012/wordml" xmlns:w16cex="http://schemas.microsoft.com/office/word/2018/wordml/cex" xmlns:w16cid="http://schemas.microsoft.com/office/word/2016/wordml/cid" xmlns:w16="http://schemas.microsoft.com/office/word/2018/wordml" xmlns:w16sdtdh="http://schemas.microsoft.com/office/word/2020/wordml/sdtdatahash" xmlns:w16se="http://schemas.microsoft.com/office/word/2015/wordml/symex" xmlns:wpg="http://schemas.microsoft.com/office/word/2010/wordprocessingGroup" xmlns:wpi="http://schemas.microsoft.com/office/word/2010/wordprocessingInk" xmlns:wne="http://schemas.microsoft.com/office/word/2006/wordml" xmlns:wps="http://schemas.microsoft.com/office/word/2010/wordprocessingShape" mc:Ignorable="w14 w15 w16se w16cid w16 w16cex w16sdtdh wp14">
+  <w:p>
+    <w:pPr>
+      <w:pStyle w:val="Footer"/>
+    </w:pPr>
+  </w:p>
+</w:ftr>
+</file>
+
 <file path=word/footnotes.xml><?xml version="1.0" encoding="utf-8"?>
 <w:footnotes xmlns:wpc="http://schemas.microsoft.com/office/word/2010/wordprocessingCanvas" xmlns:cx="http://schemas.microsoft.com/office/drawing/2014/chartex" xmlns:cx1="http://schemas.microsoft.com/office/drawing/2015/9/8/chartex" xmlns:cx2="http://schemas.microsoft.com/office/drawing/2015/10/21/chartex" xmlns:cx3="http://schemas.microsoft.com/office/drawing/2016/5/9/chartex" xmlns:cx4="http://schemas.microsoft.com/office/drawing/2016/5/10/chartex" xmlns:cx5="http://schemas.microsoft.com/office/drawing/2016/5/11/chartex" xmlns:cx6="http://schemas.microsoft.com/office/drawing/2016/5/12/chartex" xmlns:cx7="http://schemas.microsoft.com/office/drawing/2016/5/13/chartex" xmlns:cx8="http://schemas.microsoft.com/office/drawing/2016/5/14/chartex" xmlns:mc="http://schemas.openxmlformats.org/markup-compatibility/2006" xmlns:aink="http://schemas.microsoft.com/office/drawing/2016/ink" xmlns:am3d="http://schemas.microsoft.com/office/drawing/2017/model3d" xmlns:o="urn:schemas-microsoft-com:office:office" xmlns:r="http://schemas.openxmlformats.org/officeDocument/2006/relationships" xmlns:m="http://schemas.openxmlformats.org/officeDocument/2006/math" xmlns:v="urn:schemas-microsoft-com:vml" xmlns:wp14="http://schemas.microsoft.com/office/word/2010/wordprocessingDrawing" xmlns:wp="http://schemas.openxmlformats.org/drawingml/2006/wordprocessingDrawing" xmlns:w10="urn:schemas-microsoft-com:office:word" xmlns:w="http://schemas.openxmlformats.org/wordprocessingml/2006/main" xmlns:w14="http://schemas.microsoft.com/office/word/2010/wordml" xmlns:w15="http://schemas.microsoft.com/office/word/2012/wordml" xmlns:w16cex="http://schemas.microsoft.com/office/word/2018/wordml/cex" xmlns:w16cid="http://schemas.microsoft.com/office/word/2016/wordml/cid" xmlns:w16="http://schemas.microsoft.com/office/word/2018/wordml" xmlns:w16sdtdh="http://schemas.microsoft.com/office/word/2020/wordml/sdtdatahash" xmlns:w16se="http://schemas.microsoft.com/office/word/2015/wordml/symex" xmlns:wpg="http://schemas.microsoft.com/office/word/2010/wordprocessingGroup" xmlns:wpi="http://schemas.microsoft.com/office/word/2010/wordprocessingInk" xmlns:wne="http://schemas.microsoft.com/office/word/2006/wordml" xmlns:wps="http://schemas.microsoft.com/office/word/2010/wordprocessingShape" mc:Ignorable="w14 w15 w16se w16cid w16 w16cex w16sdtdh wp14">
   <w:footnote w:type="separator" w:id="-1">
@@ -1131,6 +1116,797 @@
     </w:p>
   </w:footnote>
 </w:footnotes>
+</file>
+
+<file path=word/header1.xml><?xml version="1.0" encoding="utf-8"?>
+<w:hdr xmlns:wpc="http://schemas.microsoft.com/office/word/2010/wordprocessingCanvas" xmlns:cx="http://schemas.microsoft.com/office/drawing/2014/chartex" xmlns:cx1="http://schemas.microsoft.com/office/drawing/2015/9/8/chartex" xmlns:cx2="http://schemas.microsoft.com/office/drawing/2015/10/21/chartex" xmlns:cx3="http://schemas.microsoft.com/office/drawing/2016/5/9/chartex" xmlns:cx4="http://schemas.microsoft.com/office/drawing/2016/5/10/chartex" xmlns:cx5="http://schemas.microsoft.com/office/drawing/2016/5/11/chartex" xmlns:cx6="http://schemas.microsoft.com/office/drawing/2016/5/12/chartex" xmlns:cx7="http://schemas.microsoft.com/office/drawing/2016/5/13/chartex" xmlns:cx8="http://schemas.microsoft.com/office/drawing/2016/5/14/chartex" xmlns:mc="http://schemas.openxmlformats.org/markup-compatibility/2006" xmlns:aink="http://schemas.microsoft.com/office/drawing/2016/ink" xmlns:am3d="http://schemas.microsoft.com/office/drawing/2017/model3d" xmlns:o="urn:schemas-microsoft-com:office:office" xmlns:r="http://schemas.openxmlformats.org/officeDocument/2006/relationships" xmlns:m="http://schemas.openxmlformats.org/officeDocument/2006/math" xmlns:v="urn:schemas-microsoft-com:vml" xmlns:wp14="http://schemas.microsoft.com/office/word/2010/wordprocessingDrawing" xmlns:wp="http://schemas.openxmlformats.org/drawingml/2006/wordprocessingDrawing" xmlns:w10="urn:schemas-microsoft-com:office:word" xmlns:w="http://schemas.openxmlformats.org/wordprocessingml/2006/main" xmlns:w14="http://schemas.microsoft.com/office/word/2010/wordml" xmlns:w15="http://schemas.microsoft.com/office/word/2012/wordml" xmlns:w16cex="http://schemas.microsoft.com/office/word/2018/wordml/cex" xmlns:w16cid="http://schemas.microsoft.com/office/word/2016/wordml/cid" xmlns:w16="http://schemas.microsoft.com/office/word/2018/wordml" xmlns:w16sdtdh="http://schemas.microsoft.com/office/word/2020/wordml/sdtdatahash" xmlns:w16se="http://schemas.microsoft.com/office/word/2015/wordml/symex" xmlns:wpg="http://schemas.microsoft.com/office/word/2010/wordprocessingGroup" xmlns:wpi="http://schemas.microsoft.com/office/word/2010/wordprocessingInk" xmlns:wne="http://schemas.microsoft.com/office/word/2006/wordml" xmlns:wps="http://schemas.microsoft.com/office/word/2010/wordprocessingShape" mc:Ignorable="w14 w15 w16se w16cid w16 w16cex w16sdtdh wp14">
+  <w:p>
+    <w:pPr>
+      <w:pStyle w:val="Header"/>
+    </w:pPr>
+  </w:p>
+</w:hdr>
+</file>
+
+<file path=word/header2.xml><?xml version="1.0" encoding="utf-8"?>
+<w:hdr xmlns:wpc="http://schemas.microsoft.com/office/word/2010/wordprocessingCanvas" xmlns:cx="http://schemas.microsoft.com/office/drawing/2014/chartex" xmlns:cx1="http://schemas.microsoft.com/office/drawing/2015/9/8/chartex" xmlns:cx2="http://schemas.microsoft.com/office/drawing/2015/10/21/chartex" xmlns:cx3="http://schemas.microsoft.com/office/drawing/2016/5/9/chartex" xmlns:cx4="http://schemas.microsoft.com/office/drawing/2016/5/10/chartex" xmlns:cx5="http://schemas.microsoft.com/office/drawing/2016/5/11/chartex" xmlns:cx6="http://schemas.microsoft.com/office/drawing/2016/5/12/chartex" xmlns:cx7="http://schemas.microsoft.com/office/drawing/2016/5/13/chartex" xmlns:cx8="http://schemas.microsoft.com/office/drawing/2016/5/14/chartex" xmlns:mc="http://schemas.openxmlformats.org/markup-compatibility/2006" xmlns:aink="http://schemas.microsoft.com/office/drawing/2016/ink" xmlns:am3d="http://schemas.microsoft.com/office/drawing/2017/model3d" xmlns:o="urn:schemas-microsoft-com:office:office" xmlns:r="http://schemas.openxmlformats.org/officeDocument/2006/relationships" xmlns:m="http://schemas.openxmlformats.org/officeDocument/2006/math" xmlns:v="urn:schemas-microsoft-com:vml" xmlns:wp14="http://schemas.microsoft.com/office/word/2010/wordprocessingDrawing" xmlns:wp="http://schemas.openxmlformats.org/drawingml/2006/wordprocessingDrawing" xmlns:w10="urn:schemas-microsoft-com:office:word" xmlns:w="http://schemas.openxmlformats.org/wordprocessingml/2006/main" xmlns:w14="http://schemas.microsoft.com/office/word/2010/wordml" xmlns:w15="http://schemas.microsoft.com/office/word/2012/wordml" xmlns:w16cex="http://schemas.microsoft.com/office/word/2018/wordml/cex" xmlns:w16cid="http://schemas.microsoft.com/office/word/2016/wordml/cid" xmlns:w16="http://schemas.microsoft.com/office/word/2018/wordml" xmlns:w16sdtdh="http://schemas.microsoft.com/office/word/2020/wordml/sdtdatahash" xmlns:w16se="http://schemas.microsoft.com/office/word/2015/wordml/symex" xmlns:wpg="http://schemas.microsoft.com/office/word/2010/wordprocessingGroup" xmlns:wpi="http://schemas.microsoft.com/office/word/2010/wordprocessingInk" xmlns:wne="http://schemas.microsoft.com/office/word/2006/wordml" xmlns:wps="http://schemas.microsoft.com/office/word/2010/wordprocessingShape" mc:Ignorable="w14 w15 w16se w16cid w16 w16cex w16sdtdh wp14">
+  <w:p>
+    <w:pPr>
+      <w:pStyle w:val="Header"/>
+    </w:pPr>
+  </w:p>
+  <w:p/>
+  <w:p>
+    <w:pPr>
+      <w:pStyle w:val="Header"/>
+    </w:pPr>
+    <w:r>
+      <w:rPr>
+        <w:noProof/>
+      </w:rPr>
+      <w:drawing>
+        <wp:anchor distT="0" distB="0" distL="114300" distR="114300" simplePos="0" relativeHeight="251659264" behindDoc="1" locked="0" layoutInCell="1" allowOverlap="1" wp14:anchorId="5B5DF11D" wp14:editId="244323D2">
+          <wp:simplePos x="0" y="0"/>
+          <wp:positionH relativeFrom="column">
+            <wp:posOffset>4713605</wp:posOffset>
+          </wp:positionH>
+          <wp:positionV relativeFrom="paragraph">
+            <wp:posOffset>3648339</wp:posOffset>
+          </wp:positionV>
+          <wp:extent cx="483870" cy="483870"/>
+          <wp:effectExtent l="0" t="0" r="0" b="0"/>
+          <wp:wrapTight wrapText="bothSides">
+            <wp:wrapPolygon edited="0">
+              <wp:start x="0" y="0"/>
+              <wp:lineTo x="0" y="20409"/>
+              <wp:lineTo x="20409" y="20409"/>
+              <wp:lineTo x="20409" y="0"/>
+              <wp:lineTo x="0" y="0"/>
+            </wp:wrapPolygon>
+          </wp:wrapTight>
+          <wp:docPr id="1725355045" name="Picture 1" descr="AR64"/>
+          <wp:cNvGraphicFramePr>
+            <a:graphicFrameLocks xmlns:a="http://schemas.openxmlformats.org/drawingml/2006/main" noChangeAspect="1"/>
+          </wp:cNvGraphicFramePr>
+          <a:graphic xmlns:a="http://schemas.openxmlformats.org/drawingml/2006/main">
+            <a:graphicData uri="http://schemas.openxmlformats.org/drawingml/2006/picture">
+              <pic:pic xmlns:pic="http://schemas.openxmlformats.org/drawingml/2006/picture">
+                <pic:nvPicPr>
+                  <pic:cNvPr id="0" name="Picture 16" descr="AR64"/>
+                  <pic:cNvPicPr>
+                    <a:picLocks noChangeAspect="1" noChangeArrowheads="1"/>
+                  </pic:cNvPicPr>
+                </pic:nvPicPr>
+                <pic:blipFill>
+                  <a:blip r:embed="rId1">
+                    <a:extLst>
+                      <a:ext uri="{28A0092B-C50C-407E-A947-70E740481C1C}">
+                        <a14:useLocalDpi xmlns:a14="http://schemas.microsoft.com/office/drawing/2010/main" val="0"/>
+                      </a:ext>
+                    </a:extLst>
+                  </a:blip>
+                  <a:srcRect/>
+                  <a:stretch>
+                    <a:fillRect/>
+                  </a:stretch>
+                </pic:blipFill>
+                <pic:spPr bwMode="auto">
+                  <a:xfrm>
+                    <a:off x="0" y="0"/>
+                    <a:ext cx="483870" cy="483870"/>
+                  </a:xfrm>
+                  <a:prstGeom prst="rect">
+                    <a:avLst/>
+                  </a:prstGeom>
+                  <a:noFill/>
+                  <a:ln>
+                    <a:noFill/>
+                  </a:ln>
+                </pic:spPr>
+              </pic:pic>
+            </a:graphicData>
+          </a:graphic>
+          <wp14:sizeRelH relativeFrom="page">
+            <wp14:pctWidth>0</wp14:pctWidth>
+          </wp14:sizeRelH>
+          <wp14:sizeRelV relativeFrom="page">
+            <wp14:pctHeight>0</wp14:pctHeight>
+          </wp14:sizeRelV>
+        </wp:anchor>
+      </w:drawing>
+    </w:r>
+    <w:r>
+      <w:rPr>
+        <w:noProof/>
+        <w:lang w:eastAsia="en-US" w:bidi="fa-IR"/>
+      </w:rPr>
+      <mc:AlternateContent>
+        <mc:Choice Requires="wps">
+          <w:drawing>
+            <wp:anchor distT="0" distB="0" distL="114300" distR="114300" simplePos="0" relativeHeight="251661312" behindDoc="0" locked="0" layoutInCell="1" allowOverlap="1" wp14:anchorId="4243F4EB" wp14:editId="6441B54B">
+              <wp:simplePos x="0" y="0"/>
+              <wp:positionH relativeFrom="column">
+                <wp:posOffset>4738370</wp:posOffset>
+              </wp:positionH>
+              <wp:positionV relativeFrom="paragraph">
+                <wp:posOffset>721360</wp:posOffset>
+              </wp:positionV>
+              <wp:extent cx="424815" cy="2992120"/>
+              <wp:effectExtent l="0" t="0" r="0" b="0"/>
+              <wp:wrapNone/>
+              <wp:docPr id="8" name="Text Box 7"/>
+              <wp:cNvGraphicFramePr>
+                <a:graphicFrameLocks xmlns:a="http://schemas.openxmlformats.org/drawingml/2006/main"/>
+              </wp:cNvGraphicFramePr>
+              <a:graphic xmlns:a="http://schemas.openxmlformats.org/drawingml/2006/main">
+                <a:graphicData uri="http://schemas.microsoft.com/office/word/2010/wordprocessingShape">
+                  <wps:wsp>
+                    <wps:cNvSpPr txBox="1">
+                      <a:spLocks noChangeArrowheads="1"/>
+                    </wps:cNvSpPr>
+                    <wps:spPr bwMode="auto">
+                      <a:xfrm>
+                        <a:off x="0" y="0"/>
+                        <a:ext cx="424815" cy="2992120"/>
+                      </a:xfrm>
+                      <a:prstGeom prst="rect">
+                        <a:avLst/>
+                      </a:prstGeom>
+                      <a:solidFill>
+                        <a:srgbClr val="FFFFFF"/>
+                      </a:solidFill>
+                      <a:ln>
+                        <a:noFill/>
+                      </a:ln>
+                      <a:extLst>
+                        <a:ext uri="{91240B29-F687-4F45-9708-019B960494DF}">
+                          <a14:hiddenLine xmlns:a14="http://schemas.microsoft.com/office/drawing/2010/main" w="9525">
+                            <a:solidFill>
+                              <a:srgbClr val="000000"/>
+                            </a:solidFill>
+                            <a:miter lim="800000"/>
+                            <a:headEnd/>
+                            <a:tailEnd/>
+                          </a14:hiddenLine>
+                        </a:ext>
+                      </a:extLst>
+                    </wps:spPr>
+                    <wps:txbx>
+                      <w:txbxContent>
+                        <w:p>
+                          <w:pPr>
+                            <w:bidi/>
+                            <w:jc w:val="lowKashida"/>
+                            <w:rPr>
+                              <w:rtl/>
+                              <w:lang w:bidi="fa-IR"/>
+                            </w:rPr>
+                          </w:pPr>
+                          <w:r>
+                            <w:rPr>
+                              <w:rFonts w:cs="B Tabassom" w:hint="cs"/>
+                              <w:b/>
+                              <w:bCs/>
+                              <w:sz w:val="22"/>
+                              <w:szCs w:val="22"/>
+                              <w:rtl/>
+                              <w:lang w:bidi="fa-IR"/>
+                            </w:rPr>
+                            <w:t xml:space="preserve">ابتکار و خلاقیت در علوم انسانی، دورة </w:t>
+                          </w:r>
+                          <w:r>
+                            <w:rPr>
+                              <w:rFonts w:cs="B Tabassom" w:hint="cs"/>
+                              <w:b/>
+                              <w:bCs/>
+                              <w:sz w:val="22"/>
+                              <w:szCs w:val="22"/>
+                              <w:rtl/>
+                              <w:lang w:bidi="fa-IR"/>
+                            </w:rPr>
+                            <w:t>پانزدهم</w:t>
+                          </w:r>
+                          <w:r>
+                            <w:rPr>
+                              <w:rFonts w:cs="B Tabassom" w:hint="cs"/>
+                              <w:b/>
+                              <w:bCs/>
+                              <w:sz w:val="22"/>
+                              <w:szCs w:val="22"/>
+                              <w:rtl/>
+                              <w:lang w:bidi="fa-IR"/>
+                            </w:rPr>
+                            <w:t>، شمارة</w:t>
+                          </w:r>
+                          <w:r>
+                            <w:rPr>
+                              <w:rFonts w:cs="B Tabassom" w:hint="cs"/>
+                              <w:b/>
+                              <w:bCs/>
+                              <w:sz w:val="22"/>
+                              <w:szCs w:val="22"/>
+                              <w:rtl/>
+                              <w:lang w:bidi="fa-IR"/>
+                            </w:rPr>
+                            <w:t xml:space="preserve">یک </w:t>
+                          </w:r>
+                          <w:r>
+                            <w:rPr>
+                              <w:rFonts w:cs="B Tabassom" w:hint="cs"/>
+                              <w:b/>
+                              <w:bCs/>
+                              <w:sz w:val="22"/>
+                              <w:szCs w:val="22"/>
+                              <w:rtl/>
+                              <w:lang w:bidi="fa-IR"/>
+                            </w:rPr>
+                            <w:t xml:space="preserve">، </w:t>
+                          </w:r>
+                          <w:r>
+                            <w:rPr>
+                              <w:rFonts w:cs="B Tabassom" w:hint="cs"/>
+                              <w:b/>
+                              <w:bCs/>
+                              <w:sz w:val="22"/>
+                              <w:szCs w:val="22"/>
+                              <w:rtl/>
+                              <w:lang w:bidi="fa-IR"/>
+                            </w:rPr>
+                            <w:t>تابستان 1404</w:t>
+                          </w:r>
+                        </w:p>
+                        <w:p>
+                          <w:pPr>
+                            <w:bidi/>
+                            <w:jc w:val="lowKashida"/>
+                            <w:rPr>
+                              <w:rtl/>
+                              <w:lang w:bidi="fa-IR"/>
+                            </w:rPr>
+                          </w:pPr>
+                        </w:p>
+                      </w:txbxContent>
+                    </wps:txbx>
+                    <wps:bodyPr rot="0" vert="vert270" wrap="square" lIns="91440" tIns="45720" rIns="91440" bIns="45720" anchor="t" anchorCtr="0" upright="1">
+                      <a:noAutofit/>
+                    </wps:bodyPr>
+                  </wps:wsp>
+                </a:graphicData>
+              </a:graphic>
+              <wp14:sizeRelH relativeFrom="page">
+                <wp14:pctWidth>0</wp14:pctWidth>
+              </wp14:sizeRelH>
+              <wp14:sizeRelV relativeFrom="page">
+                <wp14:pctHeight>0</wp14:pctHeight>
+              </wp14:sizeRelV>
+            </wp:anchor>
+          </w:drawing>
+        </mc:Choice>
+        <mc:Fallback>
+          <w:pict>
+            <v:shapetype w14:anchorId="4243F4EB" id="_x0000_t202" coordsize="21600,21600" o:spt="202" path="m,l,21600r21600,l21600,xe">
+              <v:stroke joinstyle="miter"/>
+              <v:path gradientshapeok="t" o:connecttype="rect"/>
+            </v:shapetype>
+            <v:shape id="Text Box 7" o:spid="_x0000_s1026" type="#_x0000_t202" style="position:absolute;margin-left:373.1pt;margin-top:56.8pt;width:33.45pt;height:235.6pt;z-index:251661312;visibility:visible;mso-wrap-style:square;mso-width-percent:0;mso-height-percent:0;mso-wrap-distance-left:9pt;mso-wrap-distance-top:0;mso-wrap-distance-right:9pt;mso-wrap-distance-bottom:0;mso-position-horizontal:absolute;mso-position-horizontal-relative:text;mso-position-vertical:absolute;mso-position-vertical-relative:text;mso-width-percent:0;mso-height-percent:0;mso-width-relative:page;mso-height-relative:page;v-text-anchor:top" o:gfxdata="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" stroked="f">
+              <v:textbox style="layout-flow:vertical;mso-layout-flow-alt:bottom-to-top">
+                <w:txbxContent>
+                  <w:p>
+                    <w:pPr>
+                      <w:bidi/>
+                      <w:jc w:val="lowKashida"/>
+                      <w:rPr>
+                        <w:rtl/>
+                        <w:lang w:bidi="fa-IR"/>
+                      </w:rPr>
+                    </w:pPr>
+                    <w:r>
+                      <w:rPr>
+                        <w:rFonts w:cs="B Tabassom" w:hint="cs"/>
+                        <w:b/>
+                        <w:bCs/>
+                        <w:sz w:val="22"/>
+                        <w:szCs w:val="22"/>
+                        <w:rtl/>
+                        <w:lang w:bidi="fa-IR"/>
+                      </w:rPr>
+                      <w:t xml:space="preserve">ابتکار و خلاقیت در علوم انسانی، دورة </w:t>
+                    </w:r>
+                    <w:r>
+                      <w:rPr>
+                        <w:rFonts w:cs="B Tabassom" w:hint="cs"/>
+                        <w:b/>
+                        <w:bCs/>
+                        <w:sz w:val="22"/>
+                        <w:szCs w:val="22"/>
+                        <w:rtl/>
+                        <w:lang w:bidi="fa-IR"/>
+                      </w:rPr>
+                      <w:t>پانزدهم</w:t>
+                    </w:r>
+                    <w:r>
+                      <w:rPr>
+                        <w:rFonts w:cs="B Tabassom" w:hint="cs"/>
+                        <w:b/>
+                        <w:bCs/>
+                        <w:sz w:val="22"/>
+                        <w:szCs w:val="22"/>
+                        <w:rtl/>
+                        <w:lang w:bidi="fa-IR"/>
+                      </w:rPr>
+                      <w:t>، شمارة</w:t>
+                    </w:r>
+                    <w:r>
+                      <w:rPr>
+                        <w:rFonts w:cs="B Tabassom" w:hint="cs"/>
+                        <w:b/>
+                        <w:bCs/>
+                        <w:sz w:val="22"/>
+                        <w:szCs w:val="22"/>
+                        <w:rtl/>
+                        <w:lang w:bidi="fa-IR"/>
+                      </w:rPr>
+                      <w:t xml:space="preserve">یک </w:t>
+                    </w:r>
+                    <w:r>
+                      <w:rPr>
+                        <w:rFonts w:cs="B Tabassom" w:hint="cs"/>
+                        <w:b/>
+                        <w:bCs/>
+                        <w:sz w:val="22"/>
+                        <w:szCs w:val="22"/>
+                        <w:rtl/>
+                        <w:lang w:bidi="fa-IR"/>
+                      </w:rPr>
+                      <w:t xml:space="preserve">، </w:t>
+                    </w:r>
+                    <w:r>
+                      <w:rPr>
+                        <w:rFonts w:cs="B Tabassom" w:hint="cs"/>
+                        <w:b/>
+                        <w:bCs/>
+                        <w:sz w:val="22"/>
+                        <w:szCs w:val="22"/>
+                        <w:rtl/>
+                        <w:lang w:bidi="fa-IR"/>
+                      </w:rPr>
+                      <w:t>تابستان 1404</w:t>
+                    </w:r>
+                  </w:p>
+                  <w:p>
+                    <w:pPr>
+                      <w:bidi/>
+                      <w:jc w:val="lowKashida"/>
+                      <w:rPr>
+                        <w:rtl/>
+                        <w:lang w:bidi="fa-IR"/>
+                      </w:rPr>
+                    </w:pPr>
+                  </w:p>
+                </w:txbxContent>
+              </v:textbox>
+            </v:shape>
+          </w:pict>
+        </mc:Fallback>
+      </mc:AlternateContent>
+    </w:r>
+    <w:r>
+      <w:rPr>
+        <w:noProof/>
+        <w:lang w:eastAsia="en-US" w:bidi="fa-IR"/>
+      </w:rPr>
+      <mc:AlternateContent>
+        <mc:Choice Requires="wps">
+          <w:drawing>
+            <wp:anchor distT="0" distB="0" distL="114300" distR="114300" simplePos="0" relativeHeight="251662336" behindDoc="0" locked="0" layoutInCell="1" allowOverlap="1" wp14:anchorId="4417B343" wp14:editId="50F864D9">
+              <wp:simplePos x="0" y="0"/>
+              <wp:positionH relativeFrom="column">
+                <wp:posOffset>4771390</wp:posOffset>
+              </wp:positionH>
+              <wp:positionV relativeFrom="paragraph">
+                <wp:posOffset>3740785</wp:posOffset>
+              </wp:positionV>
+              <wp:extent cx="391795" cy="406400"/>
+              <wp:effectExtent l="0" t="0" r="0" b="0"/>
+              <wp:wrapNone/>
+              <wp:docPr id="9" name="Text Box 5"/>
+              <wp:cNvGraphicFramePr>
+                <a:graphicFrameLocks xmlns:a="http://schemas.openxmlformats.org/drawingml/2006/main"/>
+              </wp:cNvGraphicFramePr>
+              <a:graphic xmlns:a="http://schemas.openxmlformats.org/drawingml/2006/main">
+                <a:graphicData uri="http://schemas.microsoft.com/office/word/2010/wordprocessingShape">
+                  <wps:wsp>
+                    <wps:cNvSpPr txBox="1">
+                      <a:spLocks noChangeArrowheads="1"/>
+                    </wps:cNvSpPr>
+                    <wps:spPr bwMode="auto">
+                      <a:xfrm>
+                        <a:off x="0" y="0"/>
+                        <a:ext cx="391795" cy="406400"/>
+                      </a:xfrm>
+                      <a:prstGeom prst="rect">
+                        <a:avLst/>
+                      </a:prstGeom>
+                      <a:noFill/>
+                      <a:ln>
+                        <a:noFill/>
+                      </a:ln>
+                      <a:extLst>
+                        <a:ext uri="{909E8E84-426E-40DD-AFC4-6F175D3DCCD1}">
+                          <a14:hiddenFill xmlns:a14="http://schemas.microsoft.com/office/drawing/2010/main">
+                            <a:solidFill>
+                              <a:srgbClr val="FFFFFF"/>
+                            </a:solidFill>
+                          </a14:hiddenFill>
+                        </a:ext>
+                        <a:ext uri="{91240B29-F687-4F45-9708-019B960494DF}">
+                          <a14:hiddenLine xmlns:a14="http://schemas.microsoft.com/office/drawing/2010/main" w="9525">
+                            <a:solidFill>
+                              <a:srgbClr val="000000"/>
+                            </a:solidFill>
+                            <a:miter lim="800000"/>
+                            <a:headEnd/>
+                            <a:tailEnd/>
+                          </a14:hiddenLine>
+                        </a:ext>
+                      </a:extLst>
+                    </wps:spPr>
+                    <wps:txbx>
+                      <w:txbxContent>
+                        <w:p>
+                          <w:pPr>
+                            <w:pStyle w:val="Footer"/>
+                            <w:bidi/>
+                            <w:jc w:val="center"/>
+                            <w:rPr>
+                              <w:rStyle w:val="PageNumber"/>
+                              <w:rFonts w:cs="B Zar"/>
+                              <w:rtl/>
+                              <w:lang w:bidi="fa-IR"/>
+                            </w:rPr>
+                          </w:pPr>
+                          <w:r>
+                            <w:rPr>
+                              <w:rStyle w:val="PageNumber"/>
+                              <w:rFonts w:cs="B Zar"/>
+                            </w:rPr>
+                            <w:fldChar w:fldCharType="begin"/>
+                          </w:r>
+                          <w:r>
+                            <w:rPr>
+                              <w:rStyle w:val="PageNumber"/>
+                              <w:rFonts w:cs="B Zar"/>
+                            </w:rPr>
+                            <w:instrText xml:space="preserve">PAGE  </w:instrText>
+                          </w:r>
+                          <w:r>
+                            <w:rPr>
+                              <w:rStyle w:val="PageNumber"/>
+                              <w:rFonts w:cs="B Zar"/>
+                            </w:rPr>
+                            <w:fldChar w:fldCharType="separate"/>
+                          </w:r>
+                          <w:r>
+                            <w:rPr>
+                              <w:rStyle w:val="PageNumber"/>
+                              <w:rFonts w:cs="B Zar"/>
+                              <w:rtl/>
+                            </w:rPr>
+                            <w:t>2</w:t>
+                          </w:r>
+                          <w:r>
+                            <w:rPr>
+                              <w:rStyle w:val="PageNumber"/>
+                              <w:rFonts w:cs="B Zar"/>
+                            </w:rPr>
+                            <w:fldChar w:fldCharType="end"/>
+                          </w:r>
+                        </w:p>
+                        <w:p>
+                          <w:pPr>
+                            <w:jc w:val="lowKashida"/>
+                          </w:pPr>
+                        </w:p>
+                        <w:p>
+                          <w:pPr>
+                            <w:pStyle w:val="Footer"/>
+                            <w:bidi/>
+                            <w:rPr>
+                              <w:color w:val="999999"/>
+                              <w:rtl/>
+                            </w:rPr>
+                          </w:pPr>
+                          <w:r>
+                            <w:rPr>
+                              <w:rFonts w:cs="B Tabassom" w:hint="cs"/>
+                              <w:color w:val="999999"/>
+                              <w:rtl/>
+                            </w:rPr>
+                            <w:t xml:space="preserve">بررسی </w:t>
+                          </w:r>
+                          <w:r>
+                            <w:rPr>
+                              <w:rFonts w:cs="B Tabassom"/>
+                              <w:color w:val="999999"/>
+                              <w:rtl/>
+                            </w:rPr>
+                            <w:t>تأث</w:t>
+                          </w:r>
+                          <w:r>
+                            <w:rPr>
+                              <w:rFonts w:cs="B Tabassom" w:hint="cs"/>
+                              <w:color w:val="999999"/>
+                              <w:rtl/>
+                            </w:rPr>
+                            <w:t>یر</w:t>
+                          </w:r>
+                          <w:r>
+                            <w:rPr>
+                              <w:rFonts w:cs="B Tabassom" w:hint="cs"/>
+                              <w:color w:val="999999"/>
+                              <w:rtl/>
+                            </w:rPr>
+                            <w:t xml:space="preserve"> عوامل فردی و سازمانی بر خلاقیت مدیران</w:t>
+                          </w:r>
+                          <w:r>
+                            <w:rPr>
+                              <w:rFonts w:hint="cs"/>
+                              <w:color w:val="999999"/>
+                              <w:rtl/>
+                            </w:rPr>
+                            <w:t xml:space="preserve"> ….</w:t>
+                          </w:r>
+                        </w:p>
+                        <w:p>
+                          <w:pPr>
+                            <w:bidi/>
+                            <w:jc w:val="lowKashida"/>
+                            <w:rPr>
+                              <w:sz w:val="28"/>
+                              <w:szCs w:val="28"/>
+                              <w:rtl/>
+                              <w:lang w:bidi="fa-IR"/>
+                            </w:rPr>
+                          </w:pPr>
+                        </w:p>
+                      </w:txbxContent>
+                    </wps:txbx>
+                    <wps:bodyPr rot="0" vert="horz" wrap="square" lIns="91440" tIns="45720" rIns="91440" bIns="45720" anchor="t" anchorCtr="0" upright="1">
+                      <a:noAutofit/>
+                    </wps:bodyPr>
+                  </wps:wsp>
+                </a:graphicData>
+              </a:graphic>
+              <wp14:sizeRelH relativeFrom="page">
+                <wp14:pctWidth>0</wp14:pctWidth>
+              </wp14:sizeRelH>
+              <wp14:sizeRelV relativeFrom="page">
+                <wp14:pctHeight>0</wp14:pctHeight>
+              </wp14:sizeRelV>
+            </wp:anchor>
+          </w:drawing>
+        </mc:Choice>
+        <mc:Fallback>
+          <w:pict>
+            <v:shape w14:anchorId="4417B343" id="Text Box 5" o:spid="_x0000_s1027" type="#_x0000_t202" style="position:absolute;margin-left:375.7pt;margin-top:294.55pt;width:30.85pt;height:32pt;z-index:251662336;visibility:visible;mso-wrap-style:square;mso-width-percent:0;mso-height-percent:0;mso-wrap-distance-left:9pt;mso-wrap-distance-top:0;mso-wrap-distance-right:9pt;mso-wrap-distance-bottom:0;mso-position-horizontal:absolute;mso-position-horizontal-relative:text;mso-position-vertical:absolute;mso-position-vertical-relative:text;mso-width-percent:0;mso-height-percent:0;mso-width-relative:page;mso-height-relative:page;v-text-anchor:top" o:gfxdata="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" filled="f" stroked="f">
+              <v:textbox>
+                <w:txbxContent>
+                  <w:p>
+                    <w:pPr>
+                      <w:pStyle w:val="Footer"/>
+                      <w:bidi/>
+                      <w:jc w:val="center"/>
+                      <w:rPr>
+                        <w:rStyle w:val="PageNumber"/>
+                        <w:rFonts w:cs="B Zar"/>
+                        <w:rtl/>
+                        <w:lang w:bidi="fa-IR"/>
+                      </w:rPr>
+                    </w:pPr>
+                    <w:r>
+                      <w:rPr>
+                        <w:rStyle w:val="PageNumber"/>
+                        <w:rFonts w:cs="B Zar"/>
+                      </w:rPr>
+                      <w:fldChar w:fldCharType="begin"/>
+                    </w:r>
+                    <w:r>
+                      <w:rPr>
+                        <w:rStyle w:val="PageNumber"/>
+                        <w:rFonts w:cs="B Zar"/>
+                      </w:rPr>
+                      <w:instrText xml:space="preserve">PAGE  </w:instrText>
+                    </w:r>
+                    <w:r>
+                      <w:rPr>
+                        <w:rStyle w:val="PageNumber"/>
+                        <w:rFonts w:cs="B Zar"/>
+                      </w:rPr>
+                      <w:fldChar w:fldCharType="separate"/>
+                    </w:r>
+                    <w:r>
+                      <w:rPr>
+                        <w:rStyle w:val="PageNumber"/>
+                        <w:rFonts w:cs="B Zar"/>
+                        <w:rtl/>
+                      </w:rPr>
+                      <w:t>2</w:t>
+                    </w:r>
+                    <w:r>
+                      <w:rPr>
+                        <w:rStyle w:val="PageNumber"/>
+                        <w:rFonts w:cs="B Zar"/>
+                      </w:rPr>
+                      <w:fldChar w:fldCharType="end"/>
+                    </w:r>
+                  </w:p>
+                  <w:p>
+                    <w:pPr>
+                      <w:jc w:val="lowKashida"/>
+                    </w:pPr>
+                  </w:p>
+                  <w:p>
+                    <w:pPr>
+                      <w:pStyle w:val="Footer"/>
+                      <w:bidi/>
+                      <w:rPr>
+                        <w:color w:val="999999"/>
+                        <w:rtl/>
+                      </w:rPr>
+                    </w:pPr>
+                    <w:r>
+                      <w:rPr>
+                        <w:rFonts w:cs="B Tabassom" w:hint="cs"/>
+                        <w:color w:val="999999"/>
+                        <w:rtl/>
+                      </w:rPr>
+                      <w:t xml:space="preserve">بررسی </w:t>
+                    </w:r>
+                    <w:r>
+                      <w:rPr>
+                        <w:rFonts w:cs="B Tabassom"/>
+                        <w:color w:val="999999"/>
+                        <w:rtl/>
+                      </w:rPr>
+                      <w:t>تأث</w:t>
+                    </w:r>
+                    <w:r>
+                      <w:rPr>
+                        <w:rFonts w:cs="B Tabassom" w:hint="cs"/>
+                        <w:color w:val="999999"/>
+                        <w:rtl/>
+                      </w:rPr>
+                      <w:t>یر</w:t>
+                    </w:r>
+                    <w:r>
+                      <w:rPr>
+                        <w:rFonts w:cs="B Tabassom" w:hint="cs"/>
+                        <w:color w:val="999999"/>
+                        <w:rtl/>
+                      </w:rPr>
+                      <w:t xml:space="preserve"> عوامل فردی و سازمانی بر خلاقیت مدیران</w:t>
+                    </w:r>
+                    <w:r>
+                      <w:rPr>
+                        <w:rFonts w:hint="cs"/>
+                        <w:color w:val="999999"/>
+                        <w:rtl/>
+                      </w:rPr>
+                      <w:t xml:space="preserve"> ….</w:t>
+                    </w:r>
+                  </w:p>
+                  <w:p>
+                    <w:pPr>
+                      <w:bidi/>
+                      <w:jc w:val="lowKashida"/>
+                      <w:rPr>
+                        <w:sz w:val="28"/>
+                        <w:szCs w:val="28"/>
+                        <w:rtl/>
+                        <w:lang w:bidi="fa-IR"/>
+                      </w:rPr>
+                    </w:pPr>
+                  </w:p>
+                </w:txbxContent>
+              </v:textbox>
+            </v:shape>
+          </w:pict>
+        </mc:Fallback>
+      </mc:AlternateContent>
+    </w:r>
+    <w:r>
+      <w:rPr>
+        <w:noProof/>
+        <w:lang w:eastAsia="en-US" w:bidi="fa-IR"/>
+      </w:rPr>
+      <mc:AlternateContent>
+        <mc:Choice Requires="wps">
+          <w:drawing>
+            <wp:anchor distT="0" distB="0" distL="114298" distR="114298" simplePos="0" relativeHeight="251660288" behindDoc="0" locked="0" layoutInCell="1" allowOverlap="1" wp14:anchorId="5C44EDA6" wp14:editId="57379E71">
+              <wp:simplePos x="0" y="0"/>
+              <wp:positionH relativeFrom="column">
+                <wp:posOffset>4964801</wp:posOffset>
+              </wp:positionH>
+              <wp:positionV relativeFrom="paragraph">
+                <wp:posOffset>4176395</wp:posOffset>
+              </wp:positionV>
+              <wp:extent cx="0" cy="3239770"/>
+              <wp:effectExtent l="19050" t="19050" r="38100" b="17780"/>
+              <wp:wrapNone/>
+              <wp:docPr id="7" name="Straight Connector 3"/>
+              <wp:cNvGraphicFramePr>
+                <a:graphicFrameLocks xmlns:a="http://schemas.openxmlformats.org/drawingml/2006/main"/>
+              </wp:cNvGraphicFramePr>
+              <a:graphic xmlns:a="http://schemas.openxmlformats.org/drawingml/2006/main">
+                <a:graphicData uri="http://schemas.microsoft.com/office/word/2010/wordprocessingShape">
+                  <wps:wsp>
+                    <wps:cNvCnPr>
+                      <a:cxnSpLocks noChangeShapeType="1"/>
+                    </wps:cNvCnPr>
+                    <wps:spPr bwMode="auto">
+                      <a:xfrm flipV="1">
+                        <a:off x="0" y="0"/>
+                        <a:ext cx="0" cy="3239770"/>
+                      </a:xfrm>
+                      <a:prstGeom prst="line">
+                        <a:avLst/>
+                      </a:prstGeom>
+                      <a:noFill/>
+                      <a:ln w="63500">
+                        <a:pattFill prst="pct30">
+                          <a:fgClr>
+                            <a:srgbClr val="969696"/>
+                          </a:fgClr>
+                          <a:bgClr>
+                            <a:srgbClr val="FFFFFF"/>
+                          </a:bgClr>
+                        </a:pattFill>
+                        <a:round/>
+                        <a:headEnd/>
+                        <a:tailEnd/>
+                      </a:ln>
+                      <a:extLst>
+                        <a:ext uri="{909E8E84-426E-40DD-AFC4-6F175D3DCCD1}">
+                          <a14:hiddenFill xmlns:a14="http://schemas.microsoft.com/office/drawing/2010/main">
+                            <a:noFill/>
+                          </a14:hiddenFill>
+                        </a:ext>
+                      </a:extLst>
+                    </wps:spPr>
+                    <wps:bodyPr/>
+                  </wps:wsp>
+                </a:graphicData>
+              </a:graphic>
+              <wp14:sizeRelH relativeFrom="page">
+                <wp14:pctWidth>0</wp14:pctWidth>
+              </wp14:sizeRelH>
+              <wp14:sizeRelV relativeFrom="page">
+                <wp14:pctHeight>0</wp14:pctHeight>
+              </wp14:sizeRelV>
+            </wp:anchor>
+          </w:drawing>
+        </mc:Choice>
+        <mc:Fallback xmlns:w16sdtfl="http://schemas.microsoft.com/office/word/2024/wordml/sdtformatlock" xmlns:w16du="http://schemas.microsoft.com/office/word/2023/wordml/word16du" xmlns:oel="http://schemas.microsoft.com/office/2019/extlst">
+          <w:pict>
+            <v:line w14:anchorId="5D93C56E" id="Straight Connector 3" o:spid="_x0000_s1026" style="position:absolute;left:0;text-align:left;flip:y;z-index:251660288;visibility:visible;mso-wrap-style:square;mso-width-percent:0;mso-height-percent:0;mso-wrap-distance-left:3.17494mm;mso-wrap-distance-top:0;mso-wrap-distance-right:3.17494mm;mso-wrap-distance-bottom:0;mso-position-horizontal:absolute;mso-position-horizontal-relative:text;mso-position-vertical:absolute;mso-position-vertical-relative:text;mso-width-percent:0;mso-height-percent:0;mso-width-relative:page;mso-height-relative:page" from="390.95pt,328.85pt" to="390.95pt,583.95pt" o:gfxdata="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" strokecolor="#969696" strokeweight="5pt">
+              <v:stroke r:id="rId2" o:title="" filltype="pattern"/>
+            </v:line>
+          </w:pict>
+        </mc:Fallback>
+      </mc:AlternateContent>
+    </w:r>
+  </w:p>
+</w:hdr>
+</file>
+
+<file path=word/header3.xml><?xml version="1.0" encoding="utf-8"?>
+<w:hdr xmlns:wpc="http://schemas.microsoft.com/office/word/2010/wordprocessingCanvas" xmlns:cx="http://schemas.microsoft.com/office/drawing/2014/chartex" xmlns:cx1="http://schemas.microsoft.com/office/drawing/2015/9/8/chartex" xmlns:cx2="http://schemas.microsoft.com/office/drawing/2015/10/21/chartex" xmlns:cx3="http://schemas.microsoft.com/office/drawing/2016/5/9/chartex" xmlns:cx4="http://schemas.microsoft.com/office/drawing/2016/5/10/chartex" xmlns:cx5="http://schemas.microsoft.com/office/drawing/2016/5/11/chartex" xmlns:cx6="http://schemas.microsoft.com/office/drawing/2016/5/12/chartex" xmlns:cx7="http://schemas.microsoft.com/office/drawing/2016/5/13/chartex" xmlns:cx8="http://schemas.microsoft.com/office/drawing/2016/5/14/chartex" xmlns:mc="http://schemas.openxmlformats.org/markup-compatibility/2006" xmlns:aink="http://schemas.microsoft.com/office/drawing/2016/ink" xmlns:am3d="http://schemas.microsoft.com/office/drawing/2017/model3d" xmlns:o="urn:schemas-microsoft-com:office:office" xmlns:r="http://schemas.openxmlformats.org/officeDocument/2006/relationships" xmlns:m="http://schemas.openxmlformats.org/officeDocument/2006/math" xmlns:v="urn:schemas-microsoft-com:vml" xmlns:wp14="http://schemas.microsoft.com/office/word/2010/wordprocessingDrawing" xmlns:wp="http://schemas.openxmlformats.org/drawingml/2006/wordprocessingDrawing" xmlns:w10="urn:schemas-microsoft-com:office:word" xmlns:w="http://schemas.openxmlformats.org/wordprocessingml/2006/main" xmlns:w14="http://schemas.microsoft.com/office/word/2010/wordml" xmlns:w15="http://schemas.microsoft.com/office/word/2012/wordml" xmlns:w16cex="http://schemas.microsoft.com/office/word/2018/wordml/cex" xmlns:w16cid="http://schemas.microsoft.com/office/word/2016/wordml/cid" xmlns:w16="http://schemas.microsoft.com/office/word/2018/wordml" xmlns:w16sdtdh="http://schemas.microsoft.com/office/word/2020/wordml/sdtdatahash" xmlns:w16se="http://schemas.microsoft.com/office/word/2015/wordml/symex" xmlns:wpg="http://schemas.microsoft.com/office/word/2010/wordprocessingGroup" xmlns:wpi="http://schemas.microsoft.com/office/word/2010/wordprocessingInk" xmlns:wne="http://schemas.microsoft.com/office/word/2006/wordml" xmlns:wps="http://schemas.microsoft.com/office/word/2010/wordprocessingShape" mc:Ignorable="w14 w15 w16se w16cid w16 w16cex w16sdtdh wp14">
+  <w:p>
+    <w:pPr>
+      <w:pStyle w:val="Header"/>
+    </w:pPr>
+  </w:p>
+</w:hdr>
 </file>
 
 <file path=word/styles.xml><?xml version="1.0" encoding="utf-8"?>
@@ -1184,8 +1960,8 @@
     <w:lsdException w:name="Normal Indent" w:semiHidden="1" w:unhideWhenUsed="1"/>
     <w:lsdException w:name="footnote text" w:semiHidden="1" w:unhideWhenUsed="1"/>
     <w:lsdException w:name="annotation text" w:semiHidden="1" w:unhideWhenUsed="1"/>
-    <w:lsdException w:name="header" w:semiHidden="1" w:uiPriority="9" w:unhideWhenUsed="1" w:qFormat="1"/>
-    <w:lsdException w:name="footer" w:semiHidden="1" w:unhideWhenUsed="1"/>
+    <w:lsdException w:name="header" w:semiHidden="1" w:unhideWhenUsed="1" w:qFormat="1"/>
+    <w:lsdException w:name="footer" w:semiHidden="1" w:unhideWhenUsed="1" w:qFormat="1"/>
     <w:lsdException w:name="index heading" w:semiHidden="1" w:unhideWhenUsed="1"/>
     <w:lsdException w:name="caption" w:semiHidden="1" w:uiPriority="35" w:unhideWhenUsed="1" w:qFormat="1"/>
     <w:lsdException w:name="table of figures" w:semiHidden="1" w:unhideWhenUsed="1"/>
@@ -1194,7 +1970,7 @@
     <w:lsdException w:name="footnote reference" w:semiHidden="1" w:uiPriority="0" w:unhideWhenUsed="1" w:qFormat="1"/>
     <w:lsdException w:name="annotation reference" w:semiHidden="1" w:unhideWhenUsed="1"/>
     <w:lsdException w:name="line number" w:semiHidden="1" w:unhideWhenUsed="1"/>
-    <w:lsdException w:name="page number" w:semiHidden="1" w:unhideWhenUsed="1"/>
+    <w:lsdException w:name="page number" w:semiHidden="1" w:uiPriority="0" w:unhideWhenUsed="1"/>
     <w:lsdException w:name="endnote reference" w:semiHidden="1" w:unhideWhenUsed="1"/>
     <w:lsdException w:name="endnote text" w:semiHidden="1" w:unhideWhenUsed="1"/>
     <w:lsdException w:name="table of authorities" w:semiHidden="1" w:unhideWhenUsed="1"/>
@@ -2155,7 +2931,7 @@
     <w:aliases w:val="Header Char Char,Header Char Char Char Char"/>
     <w:basedOn w:val="Normal"/>
     <w:link w:val="HeaderChar"/>
-    <w:uiPriority w:val="9"/>
+    <w:uiPriority w:val="99"/>
     <w:qFormat/>
     <w:rsid w:val="002C78CD"/>
     <w:pPr>
@@ -2170,7 +2946,7 @@
     <w:aliases w:val="Header Char Char Char,Header Char Char Char Char Char"/>
     <w:basedOn w:val="DefaultParagraphFont"/>
     <w:link w:val="Header"/>
-    <w:uiPriority w:val="9"/>
+    <w:uiPriority w:val="99"/>
     <w:rsid w:val="002C78CD"/>
     <w:rPr>
       <w:rFonts w:ascii="Times New Roman" w:eastAsia="SimSun" w:hAnsi="Times New Roman" w:cs="Times New Roman"/>
@@ -2411,6 +3187,39 @@
       <w:sz w:val="20"/>
       <w:lang w:bidi="fa-IR"/>
     </w:rPr>
+  </w:style>
+  <w:style w:type="paragraph" w:styleId="Footer">
+    <w:name w:val="footer"/>
+    <w:basedOn w:val="Normal"/>
+    <w:link w:val="FooterChar"/>
+    <w:uiPriority w:val="99"/>
+    <w:unhideWhenUsed/>
+    <w:qFormat/>
+    <w:rsid w:val="002C1580"/>
+    <w:pPr>
+      <w:tabs>
+        <w:tab w:val="center" w:pos="4513"/>
+        <w:tab w:val="right" w:pos="9026"/>
+      </w:tabs>
+    </w:pPr>
+  </w:style>
+  <w:style w:type="character" w:customStyle="1" w:styleId="FooterChar">
+    <w:name w:val="Footer Char"/>
+    <w:basedOn w:val="DefaultParagraphFont"/>
+    <w:link w:val="Footer"/>
+    <w:uiPriority w:val="99"/>
+    <w:rsid w:val="002C1580"/>
+    <w:rPr>
+      <w:rFonts w:ascii="Times New Roman" w:eastAsia="SimSun" w:hAnsi="Times New Roman" w:cs="Times New Roman"/>
+      <w:kern w:val="0"/>
+      <w:lang w:eastAsia="zh-CN" w:bidi="ar-SA"/>
+      <w14:ligatures w14:val="none"/>
+    </w:rPr>
+  </w:style>
+  <w:style w:type="character" w:styleId="PageNumber">
+    <w:name w:val="page number"/>
+    <w:basedOn w:val="DefaultParagraphFont"/>
+    <w:rsid w:val="002C1580"/>
   </w:style>
 </w:styles>
 </file>
@@ -2480,6 +3289,7 @@
 <file path=word/glossary/fontTable.xml><?xml version="1.0" encoding="utf-8"?>
 <w:fonts xmlns:mc="http://schemas.openxmlformats.org/markup-compatibility/2006" xmlns:r="http://schemas.openxmlformats.org/officeDocument/2006/relationships" xmlns:w="http://schemas.openxmlformats.org/wordprocessingml/2006/main" xmlns:w14="http://schemas.microsoft.com/office/word/2010/wordml" xmlns:w15="http://schemas.microsoft.com/office/word/2012/wordml" xmlns:w16cex="http://schemas.microsoft.com/office/word/2018/wordml/cex" xmlns:w16cid="http://schemas.microsoft.com/office/word/2016/wordml/cid" xmlns:w16="http://schemas.microsoft.com/office/word/2018/wordml" xmlns:w16sdtdh="http://schemas.microsoft.com/office/word/2020/wordml/sdtdatahash" xmlns:w16se="http://schemas.microsoft.com/office/word/2015/wordml/symex" mc:Ignorable="w14 w15 w16se w16cid w16 w16cex w16sdtdh">
   <w:font w:name="Aptos">
+    <w:altName w:val="Calibri"/>
     <w:charset w:val="00"/>
     <w:family w:val="swiss"/>
     <w:pitch w:val="variable"/>
@@ -2515,7 +3325,6 @@
     <w:pitch w:val="default"/>
   </w:font>
   <w:font w:name="B Nazanin">
-    <w:altName w:val="Arial"/>
     <w:panose1 w:val="00000400000000000000"/>
     <w:charset w:val="B2"/>
     <w:family w:val="auto"/>
@@ -2530,6 +3339,7 @@
     <w:sig w:usb0="00002001" w:usb1="80000000" w:usb2="00000008" w:usb3="00000000" w:csb0="00000040" w:csb1="00000000"/>
   </w:font>
   <w:font w:name="Aptos Display">
+    <w:altName w:val="Calibri"/>
     <w:charset w:val="00"/>
     <w:family w:val="swiss"/>
     <w:pitch w:val="variable"/>
@@ -2544,6 +3354,12 @@
   </w:font>
   <w:font w:name="B Titr">
     <w:panose1 w:val="00000700000000000000"/>
+    <w:charset w:val="B2"/>
+    <w:family w:val="auto"/>
+    <w:pitch w:val="variable"/>
+    <w:sig w:usb0="00002001" w:usb1="80000000" w:usb2="00000008" w:usb3="00000000" w:csb0="00000040" w:csb1="00000000"/>
+  </w:font>
+  <w:font w:name="B Tabassom">
     <w:charset w:val="B2"/>
     <w:family w:val="auto"/>
     <w:pitch w:val="variable"/>
@@ -2575,13 +3391,17 @@
   </w:compat>
   <w:rsids>
     <w:rsidRoot w:val="00A07AFF"/>
-    <w:rsid w:val="00031EA6"/>
     <w:rsid w:val="00036F5E"/>
+    <w:rsid w:val="00220887"/>
     <w:rsid w:val="004B7C34"/>
     <w:rsid w:val="006B1A4B"/>
-    <w:rsid w:val="008A3AE6"/>
     <w:rsid w:val="008B60DD"/>
+    <w:rsid w:val="009F4CE9"/>
     <w:rsid w:val="00A07AFF"/>
+    <w:rsid w:val="00C33B1F"/>
+    <w:rsid w:val="00C96A14"/>
+    <w:rsid w:val="00CA2FF1"/>
+    <w:rsid w:val="00F91C53"/>
     <w:rsid w:val="00FB3FB8"/>
   </w:rsids>
   <m:mathPr>

</xml_diff>